<commit_message>
refactor: merge harsh critique into writing-edit, remove redundant agent (v2.35.10)
- Delete agents/writing-reviewer.md (duplicate of writing-edit)
- Add IRON LAW, Red Flag Detection, Rationalization Table to writing-edit
- Single command for all review/verification instead of separate agent

Co-Authored-By: Claude Opus 4.5 <noreply@anthropic.com>
</commit_message>
<xml_diff>
--- a/lib/skills/writing-legal/templates/law_review_template.docx
+++ b/lib/skills/writing-legal/templates/law_review_template.docx
@@ -3900,6 +3900,17 @@
     <w:rsid w:val="00CB3812"/>
     <w:pPr>
       <w:spacing w:after="120"/>
+      <w:contextualSpacing w:val="0"/>
+    </w:pPr>
+  </w:style>
+  <w:style w:type="paragraph" w:customStyle="1" w:styleId="FirstParagraph">
+    <w:name w:val="First Paragraph"/>
+    <w:basedOn w:val="BodyText"/>
+    <w:uiPriority w:val="99"/>
+    <w:pPr>
+      <w:spacing w:after="120"/>
+      <w:ind w:firstLine="0"/>
+      <w:contextualSpacing w:val="0"/>
     </w:pPr>
   </w:style>
   <w:style w:type="character" w:customStyle="1" w:styleId="BodyTextChar">

</xml_diff>

<commit_message>
feat(writing-legal): overhaul law review template formatting and extract formatting reference (v2.42.0)
- Template: Garamond font throughout, fix heading hierarchy (Title/H1-H4),
  match reference doc indents, add body paragraph firstLine indent
- Extract formatting details to references/formatting.md (heading styles,
  body text, pandoc --reference-doc, document creation gate)
- Slim SKILL.md from 338 to 274 lines via progressive disclosure

Co-Authored-By: Claude Opus 4.6 <noreply@anthropic.com>
</commit_message>
<xml_diff>
--- a/lib/skills/writing-legal/templates/law_review_template.docx
+++ b/lib/skills/writing-legal/templates/law_review_template.docx
@@ -1,6 +1,6 @@
 
 <file path=word/document.xml><?xml version="1.0" encoding="utf-8"?>
-<w:document xmlns:wpc="http://schemas.microsoft.com/office/word/2010/wordprocessingCanvas" xmlns:cx="http://schemas.microsoft.com/office/drawing/2014/chartex" xmlns:cx1="http://schemas.microsoft.com/office/drawing/2015/9/8/chartex" xmlns:cx2="http://schemas.microsoft.com/office/drawing/2015/10/21/chartex" xmlns:cx3="http://schemas.microsoft.com/office/drawing/2016/5/9/chartex" xmlns:cx4="http://schemas.microsoft.com/office/drawing/2016/5/10/chartex" xmlns:cx5="http://schemas.microsoft.com/office/drawing/2016/5/11/chartex" xmlns:cx6="http://schemas.microsoft.com/office/drawing/2016/5/12/chartex" xmlns:cx7="http://schemas.microsoft.com/office/drawing/2016/5/13/chartex" xmlns:cx8="http://schemas.microsoft.com/office/drawing/2016/5/14/chartex" xmlns:mc="http://schemas.openxmlformats.org/markup-compatibility/2006" xmlns:aink="http://schemas.microsoft.com/office/drawing/2016/ink" xmlns:am3d="http://schemas.microsoft.com/office/drawing/2017/model3d" xmlns:o="urn:schemas-microsoft-com:office:office" xmlns:r="http://schemas.openxmlformats.org/officeDocument/2006/relationships" xmlns:m="http://schemas.openxmlformats.org/officeDocument/2006/math" xmlns:v="urn:schemas-microsoft-com:vml" xmlns:wp14="http://schemas.microsoft.com/office/word/2010/wordprocessingDrawing" xmlns:wp="http://schemas.openxmlformats.org/drawingml/2006/wordprocessingDrawing" xmlns:w10="urn:schemas-microsoft-com:office:word" xmlns:w="http://schemas.openxmlformats.org/wordprocessingml/2006/main" xmlns:w14="http://schemas.microsoft.com/office/word/2010/wordml" xmlns:w15="http://schemas.microsoft.com/office/word/2012/wordml" xmlns:w16cex="http://schemas.microsoft.com/office/word/2018/wordml/cex" xmlns:w16cid="http://schemas.microsoft.com/office/word/2016/wordml/cid" xmlns:w16="http://schemas.microsoft.com/office/word/2018/wordml" xmlns:w16se="http://schemas.microsoft.com/office/word/2015/wordml/symex" xmlns:wpg="http://schemas.microsoft.com/office/word/2010/wordprocessingGroup" xmlns:wpi="http://schemas.microsoft.com/office/word/2010/wordprocessingInk" xmlns:wne="http://schemas.microsoft.com/office/word/2006/wordml" xmlns:wps="http://schemas.microsoft.com/office/word/2010/wordprocessingShape" mc:Ignorable="w14 w15 w16se w16cid w16 w16cex wp14">
+<w:document xmlns:wpc="http://schemas.microsoft.com/office/word/2010/wordprocessingCanvas" xmlns:cx="http://schemas.microsoft.com/office/drawing/2014/chartex" xmlns:cx1="http://schemas.microsoft.com/office/drawing/2015/9/8/chartex" xmlns:cx2="http://schemas.microsoft.com/office/drawing/2015/10/21/chartex" xmlns:cx3="http://schemas.microsoft.com/office/drawing/2016/5/9/chartex" xmlns:cx4="http://schemas.microsoft.com/office/drawing/2016/5/10/chartex" xmlns:cx5="http://schemas.microsoft.com/office/drawing/2016/5/11/chartex" xmlns:cx6="http://schemas.microsoft.com/office/drawing/2016/5/12/chartex" xmlns:cx7="http://schemas.microsoft.com/office/drawing/2016/5/13/chartex" xmlns:cx8="http://schemas.microsoft.com/office/drawing/2016/5/14/chartex" xmlns:mc="http://schemas.openxmlformats.org/markup-compatibility/2006" xmlns:aink="http://schemas.microsoft.com/office/drawing/2016/ink" xmlns:am3d="http://schemas.microsoft.com/office/drawing/2017/model3d" xmlns:o="urn:schemas-microsoft-com:office:office" xmlns:oel="http://schemas.microsoft.com/office/2019/extlst" xmlns:r="http://schemas.openxmlformats.org/officeDocument/2006/relationships" xmlns:m="http://schemas.openxmlformats.org/officeDocument/2006/math" xmlns:v="urn:schemas-microsoft-com:vml" xmlns:wp14="http://schemas.microsoft.com/office/word/2010/wordprocessingDrawing" xmlns:wp="http://schemas.openxmlformats.org/drawingml/2006/wordprocessingDrawing" xmlns:w10="urn:schemas-microsoft-com:office:word" xmlns:w="http://schemas.openxmlformats.org/wordprocessingml/2006/main" xmlns:w14="http://schemas.microsoft.com/office/word/2010/wordml" xmlns:w15="http://schemas.microsoft.com/office/word/2012/wordml" xmlns:w16cex="http://schemas.microsoft.com/office/word/2018/wordml/cex" xmlns:w16cid="http://schemas.microsoft.com/office/word/2016/wordml/cid" xmlns:w16="http://schemas.microsoft.com/office/word/2018/wordml" xmlns:w16du="http://schemas.microsoft.com/office/word/2023/wordml/word16du" xmlns:w16sdtdh="http://schemas.microsoft.com/office/word/2020/wordml/sdtdatahash" xmlns:w16sdtfl="http://schemas.microsoft.com/office/word/2024/wordml/sdtformatlock" xmlns:w16se="http://schemas.microsoft.com/office/word/2015/wordml/symex" xmlns:wpg="http://schemas.microsoft.com/office/word/2010/wordprocessingGroup" xmlns:wpi="http://schemas.microsoft.com/office/word/2010/wordprocessingInk" xmlns:wne="http://schemas.microsoft.com/office/word/2006/wordml" xmlns:wps="http://schemas.microsoft.com/office/word/2010/wordprocessingShape" mc:Ignorable="w14 w15 w16se w16cid w16 w16cex w16sdtdh w16sdtfl w16du wp14">
   <w:body>
     <w:p>
       <w:pPr>
@@ -185,7 +185,7 @@
 </file>
 
 <file path=word/endnotes.xml><?xml version="1.0" encoding="utf-8"?>
-<w:endnotes xmlns:wpc="http://schemas.microsoft.com/office/word/2010/wordprocessingCanvas" xmlns:cx="http://schemas.microsoft.com/office/drawing/2014/chartex" xmlns:cx1="http://schemas.microsoft.com/office/drawing/2015/9/8/chartex" xmlns:cx2="http://schemas.microsoft.com/office/drawing/2015/10/21/chartex" xmlns:cx3="http://schemas.microsoft.com/office/drawing/2016/5/9/chartex" xmlns:cx4="http://schemas.microsoft.com/office/drawing/2016/5/10/chartex" xmlns:cx5="http://schemas.microsoft.com/office/drawing/2016/5/11/chartex" xmlns:cx6="http://schemas.microsoft.com/office/drawing/2016/5/12/chartex" xmlns:cx7="http://schemas.microsoft.com/office/drawing/2016/5/13/chartex" xmlns:cx8="http://schemas.microsoft.com/office/drawing/2016/5/14/chartex" xmlns:mc="http://schemas.openxmlformats.org/markup-compatibility/2006" xmlns:aink="http://schemas.microsoft.com/office/drawing/2016/ink" xmlns:am3d="http://schemas.microsoft.com/office/drawing/2017/model3d" xmlns:o="urn:schemas-microsoft-com:office:office" xmlns:r="http://schemas.openxmlformats.org/officeDocument/2006/relationships" xmlns:m="http://schemas.openxmlformats.org/officeDocument/2006/math" xmlns:v="urn:schemas-microsoft-com:vml" xmlns:wp14="http://schemas.microsoft.com/office/word/2010/wordprocessingDrawing" xmlns:wp="http://schemas.openxmlformats.org/drawingml/2006/wordprocessingDrawing" xmlns:w10="urn:schemas-microsoft-com:office:word" xmlns:w="http://schemas.openxmlformats.org/wordprocessingml/2006/main" xmlns:w14="http://schemas.microsoft.com/office/word/2010/wordml" xmlns:w15="http://schemas.microsoft.com/office/word/2012/wordml" xmlns:w16cex="http://schemas.microsoft.com/office/word/2018/wordml/cex" xmlns:w16cid="http://schemas.microsoft.com/office/word/2016/wordml/cid" xmlns:w16="http://schemas.microsoft.com/office/word/2018/wordml" xmlns:w16se="http://schemas.microsoft.com/office/word/2015/wordml/symex" xmlns:wpg="http://schemas.microsoft.com/office/word/2010/wordprocessingGroup" xmlns:wpi="http://schemas.microsoft.com/office/word/2010/wordprocessingInk" xmlns:wne="http://schemas.microsoft.com/office/word/2006/wordml" xmlns:wps="http://schemas.microsoft.com/office/word/2010/wordprocessingShape" mc:Ignorable="w14 w15 w16se w16cid w16 w16cex wp14">
+<w:endnotes xmlns:wpc="http://schemas.microsoft.com/office/word/2010/wordprocessingCanvas" xmlns:cx="http://schemas.microsoft.com/office/drawing/2014/chartex" xmlns:cx1="http://schemas.microsoft.com/office/drawing/2015/9/8/chartex" xmlns:cx2="http://schemas.microsoft.com/office/drawing/2015/10/21/chartex" xmlns:cx3="http://schemas.microsoft.com/office/drawing/2016/5/9/chartex" xmlns:cx4="http://schemas.microsoft.com/office/drawing/2016/5/10/chartex" xmlns:cx5="http://schemas.microsoft.com/office/drawing/2016/5/11/chartex" xmlns:cx6="http://schemas.microsoft.com/office/drawing/2016/5/12/chartex" xmlns:cx7="http://schemas.microsoft.com/office/drawing/2016/5/13/chartex" xmlns:cx8="http://schemas.microsoft.com/office/drawing/2016/5/14/chartex" xmlns:mc="http://schemas.openxmlformats.org/markup-compatibility/2006" xmlns:aink="http://schemas.microsoft.com/office/drawing/2016/ink" xmlns:am3d="http://schemas.microsoft.com/office/drawing/2017/model3d" xmlns:o="urn:schemas-microsoft-com:office:office" xmlns:oel="http://schemas.microsoft.com/office/2019/extlst" xmlns:r="http://schemas.openxmlformats.org/officeDocument/2006/relationships" xmlns:m="http://schemas.openxmlformats.org/officeDocument/2006/math" xmlns:v="urn:schemas-microsoft-com:vml" xmlns:wp14="http://schemas.microsoft.com/office/word/2010/wordprocessingDrawing" xmlns:wp="http://schemas.openxmlformats.org/drawingml/2006/wordprocessingDrawing" xmlns:w10="urn:schemas-microsoft-com:office:word" xmlns:w="http://schemas.openxmlformats.org/wordprocessingml/2006/main" xmlns:w14="http://schemas.microsoft.com/office/word/2010/wordml" xmlns:w15="http://schemas.microsoft.com/office/word/2012/wordml" xmlns:w16cex="http://schemas.microsoft.com/office/word/2018/wordml/cex" xmlns:w16cid="http://schemas.microsoft.com/office/word/2016/wordml/cid" xmlns:w16="http://schemas.microsoft.com/office/word/2018/wordml" xmlns:w16du="http://schemas.microsoft.com/office/word/2023/wordml/word16du" xmlns:w16sdtdh="http://schemas.microsoft.com/office/word/2020/wordml/sdtdatahash" xmlns:w16sdtfl="http://schemas.microsoft.com/office/word/2024/wordml/sdtformatlock" xmlns:w16se="http://schemas.microsoft.com/office/word/2015/wordml/symex" xmlns:wpg="http://schemas.microsoft.com/office/word/2010/wordprocessingGroup" xmlns:wpi="http://schemas.microsoft.com/office/word/2010/wordprocessingInk" xmlns:wne="http://schemas.microsoft.com/office/word/2006/wordml" xmlns:wps="http://schemas.microsoft.com/office/word/2010/wordprocessingShape" mc:Ignorable="w14 w15 w16se w16cid w16 w16cex w16sdtdh w16sdtfl w16du wp14">
   <w:endnote w:type="separator" w:id="-1">
     <w:p>
       <w:r>
@@ -207,7 +207,7 @@
 </file>
 
 <file path=word/footer1.xml><?xml version="1.0" encoding="utf-8"?>
-<w:ftr xmlns:wpc="http://schemas.microsoft.com/office/word/2010/wordprocessingCanvas" xmlns:cx="http://schemas.microsoft.com/office/drawing/2014/chartex" xmlns:cx1="http://schemas.microsoft.com/office/drawing/2015/9/8/chartex" xmlns:cx2="http://schemas.microsoft.com/office/drawing/2015/10/21/chartex" xmlns:cx3="http://schemas.microsoft.com/office/drawing/2016/5/9/chartex" xmlns:cx4="http://schemas.microsoft.com/office/drawing/2016/5/10/chartex" xmlns:cx5="http://schemas.microsoft.com/office/drawing/2016/5/11/chartex" xmlns:cx6="http://schemas.microsoft.com/office/drawing/2016/5/12/chartex" xmlns:cx7="http://schemas.microsoft.com/office/drawing/2016/5/13/chartex" xmlns:cx8="http://schemas.microsoft.com/office/drawing/2016/5/14/chartex" xmlns:mc="http://schemas.openxmlformats.org/markup-compatibility/2006" xmlns:aink="http://schemas.microsoft.com/office/drawing/2016/ink" xmlns:am3d="http://schemas.microsoft.com/office/drawing/2017/model3d" xmlns:o="urn:schemas-microsoft-com:office:office" xmlns:r="http://schemas.openxmlformats.org/officeDocument/2006/relationships" xmlns:m="http://schemas.openxmlformats.org/officeDocument/2006/math" xmlns:v="urn:schemas-microsoft-com:vml" xmlns:wp14="http://schemas.microsoft.com/office/word/2010/wordprocessingDrawing" xmlns:wp="http://schemas.openxmlformats.org/drawingml/2006/wordprocessingDrawing" xmlns:w10="urn:schemas-microsoft-com:office:word" xmlns:w="http://schemas.openxmlformats.org/wordprocessingml/2006/main" xmlns:w14="http://schemas.microsoft.com/office/word/2010/wordml" xmlns:w15="http://schemas.microsoft.com/office/word/2012/wordml" xmlns:w16cex="http://schemas.microsoft.com/office/word/2018/wordml/cex" xmlns:w16cid="http://schemas.microsoft.com/office/word/2016/wordml/cid" xmlns:w16="http://schemas.microsoft.com/office/word/2018/wordml" xmlns:w16se="http://schemas.microsoft.com/office/word/2015/wordml/symex" xmlns:wpg="http://schemas.microsoft.com/office/word/2010/wordprocessingGroup" xmlns:wpi="http://schemas.microsoft.com/office/word/2010/wordprocessingInk" xmlns:wne="http://schemas.microsoft.com/office/word/2006/wordml" xmlns:wps="http://schemas.microsoft.com/office/word/2010/wordprocessingShape" mc:Ignorable="w14 w15 w16se w16cid w16 w16cex wp14">
+<w:ftr xmlns:wpc="http://schemas.microsoft.com/office/word/2010/wordprocessingCanvas" xmlns:cx="http://schemas.microsoft.com/office/drawing/2014/chartex" xmlns:cx1="http://schemas.microsoft.com/office/drawing/2015/9/8/chartex" xmlns:cx2="http://schemas.microsoft.com/office/drawing/2015/10/21/chartex" xmlns:cx3="http://schemas.microsoft.com/office/drawing/2016/5/9/chartex" xmlns:cx4="http://schemas.microsoft.com/office/drawing/2016/5/10/chartex" xmlns:cx5="http://schemas.microsoft.com/office/drawing/2016/5/11/chartex" xmlns:cx6="http://schemas.microsoft.com/office/drawing/2016/5/12/chartex" xmlns:cx7="http://schemas.microsoft.com/office/drawing/2016/5/13/chartex" xmlns:cx8="http://schemas.microsoft.com/office/drawing/2016/5/14/chartex" xmlns:mc="http://schemas.openxmlformats.org/markup-compatibility/2006" xmlns:aink="http://schemas.microsoft.com/office/drawing/2016/ink" xmlns:am3d="http://schemas.microsoft.com/office/drawing/2017/model3d" xmlns:o="urn:schemas-microsoft-com:office:office" xmlns:oel="http://schemas.microsoft.com/office/2019/extlst" xmlns:r="http://schemas.openxmlformats.org/officeDocument/2006/relationships" xmlns:m="http://schemas.openxmlformats.org/officeDocument/2006/math" xmlns:v="urn:schemas-microsoft-com:vml" xmlns:wp14="http://schemas.microsoft.com/office/word/2010/wordprocessingDrawing" xmlns:wp="http://schemas.openxmlformats.org/drawingml/2006/wordprocessingDrawing" xmlns:w10="urn:schemas-microsoft-com:office:word" xmlns:w="http://schemas.openxmlformats.org/wordprocessingml/2006/main" xmlns:w14="http://schemas.microsoft.com/office/word/2010/wordml" xmlns:w15="http://schemas.microsoft.com/office/word/2012/wordml" xmlns:w16cex="http://schemas.microsoft.com/office/word/2018/wordml/cex" xmlns:w16cid="http://schemas.microsoft.com/office/word/2016/wordml/cid" xmlns:w16="http://schemas.microsoft.com/office/word/2018/wordml" xmlns:w16du="http://schemas.microsoft.com/office/word/2023/wordml/word16du" xmlns:w16sdtdh="http://schemas.microsoft.com/office/word/2020/wordml/sdtdatahash" xmlns:w16sdtfl="http://schemas.microsoft.com/office/word/2024/wordml/sdtformatlock" xmlns:w16se="http://schemas.microsoft.com/office/word/2015/wordml/symex" xmlns:wpg="http://schemas.microsoft.com/office/word/2010/wordprocessingGroup" xmlns:wpi="http://schemas.microsoft.com/office/word/2010/wordprocessingInk" xmlns:wne="http://schemas.microsoft.com/office/word/2006/wordml" xmlns:wps="http://schemas.microsoft.com/office/word/2010/wordprocessingShape" mc:Ignorable="w14 w15 w16se w16cid w16 w16cex w16sdtdh w16sdtfl w16du wp14">
   <w:p>
     <w:pPr>
       <w:pStyle w:val="Footer"/>
@@ -272,7 +272,7 @@
 </file>
 
 <file path=word/footer2.xml><?xml version="1.0" encoding="utf-8"?>
-<w:ftr xmlns:wpc="http://schemas.microsoft.com/office/word/2010/wordprocessingCanvas" xmlns:cx="http://schemas.microsoft.com/office/drawing/2014/chartex" xmlns:cx1="http://schemas.microsoft.com/office/drawing/2015/9/8/chartex" xmlns:cx2="http://schemas.microsoft.com/office/drawing/2015/10/21/chartex" xmlns:cx3="http://schemas.microsoft.com/office/drawing/2016/5/9/chartex" xmlns:cx4="http://schemas.microsoft.com/office/drawing/2016/5/10/chartex" xmlns:cx5="http://schemas.microsoft.com/office/drawing/2016/5/11/chartex" xmlns:cx6="http://schemas.microsoft.com/office/drawing/2016/5/12/chartex" xmlns:cx7="http://schemas.microsoft.com/office/drawing/2016/5/13/chartex" xmlns:cx8="http://schemas.microsoft.com/office/drawing/2016/5/14/chartex" xmlns:mc="http://schemas.openxmlformats.org/markup-compatibility/2006" xmlns:aink="http://schemas.microsoft.com/office/drawing/2016/ink" xmlns:am3d="http://schemas.microsoft.com/office/drawing/2017/model3d" xmlns:o="urn:schemas-microsoft-com:office:office" xmlns:r="http://schemas.openxmlformats.org/officeDocument/2006/relationships" xmlns:m="http://schemas.openxmlformats.org/officeDocument/2006/math" xmlns:v="urn:schemas-microsoft-com:vml" xmlns:wp14="http://schemas.microsoft.com/office/word/2010/wordprocessingDrawing" xmlns:wp="http://schemas.openxmlformats.org/drawingml/2006/wordprocessingDrawing" xmlns:w10="urn:schemas-microsoft-com:office:word" xmlns:w="http://schemas.openxmlformats.org/wordprocessingml/2006/main" xmlns:w14="http://schemas.microsoft.com/office/word/2010/wordml" xmlns:w15="http://schemas.microsoft.com/office/word/2012/wordml" xmlns:w16cex="http://schemas.microsoft.com/office/word/2018/wordml/cex" xmlns:w16cid="http://schemas.microsoft.com/office/word/2016/wordml/cid" xmlns:w16="http://schemas.microsoft.com/office/word/2018/wordml" xmlns:w16se="http://schemas.microsoft.com/office/word/2015/wordml/symex" xmlns:wpg="http://schemas.microsoft.com/office/word/2010/wordprocessingGroup" xmlns:wpi="http://schemas.microsoft.com/office/word/2010/wordprocessingInk" xmlns:wne="http://schemas.microsoft.com/office/word/2006/wordml" xmlns:wps="http://schemas.microsoft.com/office/word/2010/wordprocessingShape" mc:Ignorable="w14 w15 w16se w16cid w16 w16cex wp14">
+<w:ftr xmlns:wpc="http://schemas.microsoft.com/office/word/2010/wordprocessingCanvas" xmlns:cx="http://schemas.microsoft.com/office/drawing/2014/chartex" xmlns:cx1="http://schemas.microsoft.com/office/drawing/2015/9/8/chartex" xmlns:cx2="http://schemas.microsoft.com/office/drawing/2015/10/21/chartex" xmlns:cx3="http://schemas.microsoft.com/office/drawing/2016/5/9/chartex" xmlns:cx4="http://schemas.microsoft.com/office/drawing/2016/5/10/chartex" xmlns:cx5="http://schemas.microsoft.com/office/drawing/2016/5/11/chartex" xmlns:cx6="http://schemas.microsoft.com/office/drawing/2016/5/12/chartex" xmlns:cx7="http://schemas.microsoft.com/office/drawing/2016/5/13/chartex" xmlns:cx8="http://schemas.microsoft.com/office/drawing/2016/5/14/chartex" xmlns:mc="http://schemas.openxmlformats.org/markup-compatibility/2006" xmlns:aink="http://schemas.microsoft.com/office/drawing/2016/ink" xmlns:am3d="http://schemas.microsoft.com/office/drawing/2017/model3d" xmlns:o="urn:schemas-microsoft-com:office:office" xmlns:oel="http://schemas.microsoft.com/office/2019/extlst" xmlns:r="http://schemas.openxmlformats.org/officeDocument/2006/relationships" xmlns:m="http://schemas.openxmlformats.org/officeDocument/2006/math" xmlns:v="urn:schemas-microsoft-com:vml" xmlns:wp14="http://schemas.microsoft.com/office/word/2010/wordprocessingDrawing" xmlns:wp="http://schemas.openxmlformats.org/drawingml/2006/wordprocessingDrawing" xmlns:w10="urn:schemas-microsoft-com:office:word" xmlns:w="http://schemas.openxmlformats.org/wordprocessingml/2006/main" xmlns:w14="http://schemas.microsoft.com/office/word/2010/wordml" xmlns:w15="http://schemas.microsoft.com/office/word/2012/wordml" xmlns:w16cex="http://schemas.microsoft.com/office/word/2018/wordml/cex" xmlns:w16cid="http://schemas.microsoft.com/office/word/2016/wordml/cid" xmlns:w16="http://schemas.microsoft.com/office/word/2018/wordml" xmlns:w16du="http://schemas.microsoft.com/office/word/2023/wordml/word16du" xmlns:w16sdtdh="http://schemas.microsoft.com/office/word/2020/wordml/sdtdatahash" xmlns:w16sdtfl="http://schemas.microsoft.com/office/word/2024/wordml/sdtformatlock" xmlns:w16se="http://schemas.microsoft.com/office/word/2015/wordml/symex" xmlns:wpg="http://schemas.microsoft.com/office/word/2010/wordprocessingGroup" xmlns:wpi="http://schemas.microsoft.com/office/word/2010/wordprocessingInk" xmlns:wne="http://schemas.microsoft.com/office/word/2006/wordml" xmlns:wps="http://schemas.microsoft.com/office/word/2010/wordprocessingShape" mc:Ignorable="w14 w15 w16se w16cid w16 w16cex w16sdtdh w16sdtfl w16du wp14">
   <w:p>
     <w:pPr>
       <w:pStyle w:val="Footer"/>
@@ -338,7 +338,7 @@
 </file>
 
 <file path=word/footnotes.xml><?xml version="1.0" encoding="utf-8"?>
-<w:footnotes xmlns:wpc="http://schemas.microsoft.com/office/word/2010/wordprocessingCanvas" xmlns:cx="http://schemas.microsoft.com/office/drawing/2014/chartex" xmlns:cx1="http://schemas.microsoft.com/office/drawing/2015/9/8/chartex" xmlns:cx2="http://schemas.microsoft.com/office/drawing/2015/10/21/chartex" xmlns:cx3="http://schemas.microsoft.com/office/drawing/2016/5/9/chartex" xmlns:cx4="http://schemas.microsoft.com/office/drawing/2016/5/10/chartex" xmlns:cx5="http://schemas.microsoft.com/office/drawing/2016/5/11/chartex" xmlns:cx6="http://schemas.microsoft.com/office/drawing/2016/5/12/chartex" xmlns:cx7="http://schemas.microsoft.com/office/drawing/2016/5/13/chartex" xmlns:cx8="http://schemas.microsoft.com/office/drawing/2016/5/14/chartex" xmlns:mc="http://schemas.openxmlformats.org/markup-compatibility/2006" xmlns:aink="http://schemas.microsoft.com/office/drawing/2016/ink" xmlns:am3d="http://schemas.microsoft.com/office/drawing/2017/model3d" xmlns:o="urn:schemas-microsoft-com:office:office" xmlns:r="http://schemas.openxmlformats.org/officeDocument/2006/relationships" xmlns:m="http://schemas.openxmlformats.org/officeDocument/2006/math" xmlns:v="urn:schemas-microsoft-com:vml" xmlns:wp14="http://schemas.microsoft.com/office/word/2010/wordprocessingDrawing" xmlns:wp="http://schemas.openxmlformats.org/drawingml/2006/wordprocessingDrawing" xmlns:w10="urn:schemas-microsoft-com:office:word" xmlns:w="http://schemas.openxmlformats.org/wordprocessingml/2006/main" xmlns:w14="http://schemas.microsoft.com/office/word/2010/wordml" xmlns:w15="http://schemas.microsoft.com/office/word/2012/wordml" xmlns:w16cex="http://schemas.microsoft.com/office/word/2018/wordml/cex" xmlns:w16cid="http://schemas.microsoft.com/office/word/2016/wordml/cid" xmlns:w16="http://schemas.microsoft.com/office/word/2018/wordml" xmlns:w16se="http://schemas.microsoft.com/office/word/2015/wordml/symex" xmlns:wpg="http://schemas.microsoft.com/office/word/2010/wordprocessingGroup" xmlns:wpi="http://schemas.microsoft.com/office/word/2010/wordprocessingInk" xmlns:wne="http://schemas.microsoft.com/office/word/2006/wordml" xmlns:wps="http://schemas.microsoft.com/office/word/2010/wordprocessingShape" mc:Ignorable="w14 w15 w16se w16cid w16 w16cex wp14">
+<w:footnotes xmlns:wpc="http://schemas.microsoft.com/office/word/2010/wordprocessingCanvas" xmlns:cx="http://schemas.microsoft.com/office/drawing/2014/chartex" xmlns:cx1="http://schemas.microsoft.com/office/drawing/2015/9/8/chartex" xmlns:cx2="http://schemas.microsoft.com/office/drawing/2015/10/21/chartex" xmlns:cx3="http://schemas.microsoft.com/office/drawing/2016/5/9/chartex" xmlns:cx4="http://schemas.microsoft.com/office/drawing/2016/5/10/chartex" xmlns:cx5="http://schemas.microsoft.com/office/drawing/2016/5/11/chartex" xmlns:cx6="http://schemas.microsoft.com/office/drawing/2016/5/12/chartex" xmlns:cx7="http://schemas.microsoft.com/office/drawing/2016/5/13/chartex" xmlns:cx8="http://schemas.microsoft.com/office/drawing/2016/5/14/chartex" xmlns:mc="http://schemas.openxmlformats.org/markup-compatibility/2006" xmlns:aink="http://schemas.microsoft.com/office/drawing/2016/ink" xmlns:am3d="http://schemas.microsoft.com/office/drawing/2017/model3d" xmlns:o="urn:schemas-microsoft-com:office:office" xmlns:oel="http://schemas.microsoft.com/office/2019/extlst" xmlns:r="http://schemas.openxmlformats.org/officeDocument/2006/relationships" xmlns:m="http://schemas.openxmlformats.org/officeDocument/2006/math" xmlns:v="urn:schemas-microsoft-com:vml" xmlns:wp14="http://schemas.microsoft.com/office/word/2010/wordprocessingDrawing" xmlns:wp="http://schemas.openxmlformats.org/drawingml/2006/wordprocessingDrawing" xmlns:w10="urn:schemas-microsoft-com:office:word" xmlns:w="http://schemas.openxmlformats.org/wordprocessingml/2006/main" xmlns:w14="http://schemas.microsoft.com/office/word/2010/wordml" xmlns:w15="http://schemas.microsoft.com/office/word/2012/wordml" xmlns:w16cex="http://schemas.microsoft.com/office/word/2018/wordml/cex" xmlns:w16cid="http://schemas.microsoft.com/office/word/2016/wordml/cid" xmlns:w16="http://schemas.microsoft.com/office/word/2018/wordml" xmlns:w16du="http://schemas.microsoft.com/office/word/2023/wordml/word16du" xmlns:w16sdtdh="http://schemas.microsoft.com/office/word/2020/wordml/sdtdatahash" xmlns:w16sdtfl="http://schemas.microsoft.com/office/word/2024/wordml/sdtformatlock" xmlns:w16se="http://schemas.microsoft.com/office/word/2015/wordml/symex" xmlns:wpg="http://schemas.microsoft.com/office/word/2010/wordprocessingGroup" xmlns:wpi="http://schemas.microsoft.com/office/word/2010/wordprocessingInk" xmlns:wne="http://schemas.microsoft.com/office/word/2006/wordml" xmlns:wps="http://schemas.microsoft.com/office/word/2010/wordprocessingShape" mc:Ignorable="w14 w15 w16se w16cid w16 w16cex w16sdtdh w16sdtfl w16du wp14">
   <w:footnote w:type="separator" w:id="-1">
     <w:p>
       <w:r>
@@ -360,7 +360,7 @@
 </file>
 
 <file path=word/header1.xml><?xml version="1.0" encoding="utf-8"?>
-<w:hdr xmlns:wpc="http://schemas.microsoft.com/office/word/2010/wordprocessingCanvas" xmlns:cx="http://schemas.microsoft.com/office/drawing/2014/chartex" xmlns:cx1="http://schemas.microsoft.com/office/drawing/2015/9/8/chartex" xmlns:cx2="http://schemas.microsoft.com/office/drawing/2015/10/21/chartex" xmlns:cx3="http://schemas.microsoft.com/office/drawing/2016/5/9/chartex" xmlns:cx4="http://schemas.microsoft.com/office/drawing/2016/5/10/chartex" xmlns:cx5="http://schemas.microsoft.com/office/drawing/2016/5/11/chartex" xmlns:cx6="http://schemas.microsoft.com/office/drawing/2016/5/12/chartex" xmlns:cx7="http://schemas.microsoft.com/office/drawing/2016/5/13/chartex" xmlns:cx8="http://schemas.microsoft.com/office/drawing/2016/5/14/chartex" xmlns:mc="http://schemas.openxmlformats.org/markup-compatibility/2006" xmlns:aink="http://schemas.microsoft.com/office/drawing/2016/ink" xmlns:am3d="http://schemas.microsoft.com/office/drawing/2017/model3d" xmlns:o="urn:schemas-microsoft-com:office:office" xmlns:r="http://schemas.openxmlformats.org/officeDocument/2006/relationships" xmlns:m="http://schemas.openxmlformats.org/officeDocument/2006/math" xmlns:v="urn:schemas-microsoft-com:vml" xmlns:wp14="http://schemas.microsoft.com/office/word/2010/wordprocessingDrawing" xmlns:wp="http://schemas.openxmlformats.org/drawingml/2006/wordprocessingDrawing" xmlns:w10="urn:schemas-microsoft-com:office:word" xmlns:w="http://schemas.openxmlformats.org/wordprocessingml/2006/main" xmlns:w14="http://schemas.microsoft.com/office/word/2010/wordml" xmlns:w15="http://schemas.microsoft.com/office/word/2012/wordml" xmlns:w16cex="http://schemas.microsoft.com/office/word/2018/wordml/cex" xmlns:w16cid="http://schemas.microsoft.com/office/word/2016/wordml/cid" xmlns:w16="http://schemas.microsoft.com/office/word/2018/wordml" xmlns:w16se="http://schemas.microsoft.com/office/word/2015/wordml/symex" xmlns:wpg="http://schemas.microsoft.com/office/word/2010/wordprocessingGroup" xmlns:wpi="http://schemas.microsoft.com/office/word/2010/wordprocessingInk" xmlns:wne="http://schemas.microsoft.com/office/word/2006/wordml" xmlns:wps="http://schemas.microsoft.com/office/word/2010/wordprocessingShape" mc:Ignorable="w14 w15 w16se w16cid w16 w16cex wp14">
+<w:hdr xmlns:wpc="http://schemas.microsoft.com/office/word/2010/wordprocessingCanvas" xmlns:cx="http://schemas.microsoft.com/office/drawing/2014/chartex" xmlns:cx1="http://schemas.microsoft.com/office/drawing/2015/9/8/chartex" xmlns:cx2="http://schemas.microsoft.com/office/drawing/2015/10/21/chartex" xmlns:cx3="http://schemas.microsoft.com/office/drawing/2016/5/9/chartex" xmlns:cx4="http://schemas.microsoft.com/office/drawing/2016/5/10/chartex" xmlns:cx5="http://schemas.microsoft.com/office/drawing/2016/5/11/chartex" xmlns:cx6="http://schemas.microsoft.com/office/drawing/2016/5/12/chartex" xmlns:cx7="http://schemas.microsoft.com/office/drawing/2016/5/13/chartex" xmlns:cx8="http://schemas.microsoft.com/office/drawing/2016/5/14/chartex" xmlns:mc="http://schemas.openxmlformats.org/markup-compatibility/2006" xmlns:aink="http://schemas.microsoft.com/office/drawing/2016/ink" xmlns:am3d="http://schemas.microsoft.com/office/drawing/2017/model3d" xmlns:o="urn:schemas-microsoft-com:office:office" xmlns:oel="http://schemas.microsoft.com/office/2019/extlst" xmlns:r="http://schemas.openxmlformats.org/officeDocument/2006/relationships" xmlns:m="http://schemas.openxmlformats.org/officeDocument/2006/math" xmlns:v="urn:schemas-microsoft-com:vml" xmlns:wp14="http://schemas.microsoft.com/office/word/2010/wordprocessingDrawing" xmlns:wp="http://schemas.openxmlformats.org/drawingml/2006/wordprocessingDrawing" xmlns:w10="urn:schemas-microsoft-com:office:word" xmlns:w="http://schemas.openxmlformats.org/wordprocessingml/2006/main" xmlns:w14="http://schemas.microsoft.com/office/word/2010/wordml" xmlns:w15="http://schemas.microsoft.com/office/word/2012/wordml" xmlns:w16cex="http://schemas.microsoft.com/office/word/2018/wordml/cex" xmlns:w16cid="http://schemas.microsoft.com/office/word/2016/wordml/cid" xmlns:w16="http://schemas.microsoft.com/office/word/2018/wordml" xmlns:w16du="http://schemas.microsoft.com/office/word/2023/wordml/word16du" xmlns:w16sdtdh="http://schemas.microsoft.com/office/word/2020/wordml/sdtdatahash" xmlns:w16sdtfl="http://schemas.microsoft.com/office/word/2024/wordml/sdtformatlock" xmlns:w16se="http://schemas.microsoft.com/office/word/2015/wordml/symex" xmlns:wpg="http://schemas.microsoft.com/office/word/2010/wordprocessingGroup" xmlns:wpi="http://schemas.microsoft.com/office/word/2010/wordprocessingInk" xmlns:wne="http://schemas.microsoft.com/office/word/2006/wordml" xmlns:wps="http://schemas.microsoft.com/office/word/2010/wordprocessingShape" mc:Ignorable="w14 w15 w16se w16cid w16 w16cex w16sdtdh w16sdtfl w16du wp14">
   <w:p>
     <w:pPr>
       <w:pStyle w:val="Header"/>
@@ -386,7 +386,7 @@
 </file>
 
 <file path=word/numbering.xml><?xml version="1.0" encoding="utf-8"?>
-<w:numbering xmlns:wpc="http://schemas.microsoft.com/office/word/2010/wordprocessingCanvas" xmlns:cx="http://schemas.microsoft.com/office/drawing/2014/chartex" xmlns:cx1="http://schemas.microsoft.com/office/drawing/2015/9/8/chartex" xmlns:cx2="http://schemas.microsoft.com/office/drawing/2015/10/21/chartex" xmlns:cx3="http://schemas.microsoft.com/office/drawing/2016/5/9/chartex" xmlns:cx4="http://schemas.microsoft.com/office/drawing/2016/5/10/chartex" xmlns:cx5="http://schemas.microsoft.com/office/drawing/2016/5/11/chartex" xmlns:cx6="http://schemas.microsoft.com/office/drawing/2016/5/12/chartex" xmlns:cx7="http://schemas.microsoft.com/office/drawing/2016/5/13/chartex" xmlns:cx8="http://schemas.microsoft.com/office/drawing/2016/5/14/chartex" xmlns:mc="http://schemas.openxmlformats.org/markup-compatibility/2006" xmlns:aink="http://schemas.microsoft.com/office/drawing/2016/ink" xmlns:am3d="http://schemas.microsoft.com/office/drawing/2017/model3d" xmlns:o="urn:schemas-microsoft-com:office:office" xmlns:r="http://schemas.openxmlformats.org/officeDocument/2006/relationships" xmlns:m="http://schemas.openxmlformats.org/officeDocument/2006/math" xmlns:v="urn:schemas-microsoft-com:vml" xmlns:wp14="http://schemas.microsoft.com/office/word/2010/wordprocessingDrawing" xmlns:wp="http://schemas.openxmlformats.org/drawingml/2006/wordprocessingDrawing" xmlns:w10="urn:schemas-microsoft-com:office:word" xmlns:w="http://schemas.openxmlformats.org/wordprocessingml/2006/main" xmlns:w14="http://schemas.microsoft.com/office/word/2010/wordml" xmlns:w15="http://schemas.microsoft.com/office/word/2012/wordml" xmlns:w16cex="http://schemas.microsoft.com/office/word/2018/wordml/cex" xmlns:w16cid="http://schemas.microsoft.com/office/word/2016/wordml/cid" xmlns:w16="http://schemas.microsoft.com/office/word/2018/wordml" xmlns:w16se="http://schemas.microsoft.com/office/word/2015/wordml/symex" xmlns:wpg="http://schemas.microsoft.com/office/word/2010/wordprocessingGroup" xmlns:wpi="http://schemas.microsoft.com/office/word/2010/wordprocessingInk" xmlns:wne="http://schemas.microsoft.com/office/word/2006/wordml" xmlns:wps="http://schemas.microsoft.com/office/word/2010/wordprocessingShape" mc:Ignorable="w14 w15 w16se w16cid w16 w16cex wp14">
+<w:numbering xmlns:wpc="http://schemas.microsoft.com/office/word/2010/wordprocessingCanvas" xmlns:cx="http://schemas.microsoft.com/office/drawing/2014/chartex" xmlns:cx1="http://schemas.microsoft.com/office/drawing/2015/9/8/chartex" xmlns:cx2="http://schemas.microsoft.com/office/drawing/2015/10/21/chartex" xmlns:cx3="http://schemas.microsoft.com/office/drawing/2016/5/9/chartex" xmlns:cx4="http://schemas.microsoft.com/office/drawing/2016/5/10/chartex" xmlns:cx5="http://schemas.microsoft.com/office/drawing/2016/5/11/chartex" xmlns:cx6="http://schemas.microsoft.com/office/drawing/2016/5/12/chartex" xmlns:cx7="http://schemas.microsoft.com/office/drawing/2016/5/13/chartex" xmlns:cx8="http://schemas.microsoft.com/office/drawing/2016/5/14/chartex" xmlns:mc="http://schemas.openxmlformats.org/markup-compatibility/2006" xmlns:aink="http://schemas.microsoft.com/office/drawing/2016/ink" xmlns:am3d="http://schemas.microsoft.com/office/drawing/2017/model3d" xmlns:o="urn:schemas-microsoft-com:office:office" xmlns:oel="http://schemas.microsoft.com/office/2019/extlst" xmlns:r="http://schemas.openxmlformats.org/officeDocument/2006/relationships" xmlns:m="http://schemas.openxmlformats.org/officeDocument/2006/math" xmlns:v="urn:schemas-microsoft-com:vml" xmlns:wp14="http://schemas.microsoft.com/office/word/2010/wordprocessingDrawing" xmlns:wp="http://schemas.openxmlformats.org/drawingml/2006/wordprocessingDrawing" xmlns:w10="urn:schemas-microsoft-com:office:word" xmlns:w="http://schemas.openxmlformats.org/wordprocessingml/2006/main" xmlns:w14="http://schemas.microsoft.com/office/word/2010/wordml" xmlns:w15="http://schemas.microsoft.com/office/word/2012/wordml" xmlns:w16cex="http://schemas.microsoft.com/office/word/2018/wordml/cex" xmlns:w16cid="http://schemas.microsoft.com/office/word/2016/wordml/cid" xmlns:w16="http://schemas.microsoft.com/office/word/2018/wordml" xmlns:w16du="http://schemas.microsoft.com/office/word/2023/wordml/word16du" xmlns:w16sdtdh="http://schemas.microsoft.com/office/word/2020/wordml/sdtdatahash" xmlns:w16sdtfl="http://schemas.microsoft.com/office/word/2024/wordml/sdtformatlock" xmlns:w16se="http://schemas.microsoft.com/office/word/2015/wordml/symex" xmlns:wpg="http://schemas.microsoft.com/office/word/2010/wordprocessingGroup" xmlns:wpi="http://schemas.microsoft.com/office/word/2010/wordprocessingInk" xmlns:wne="http://schemas.microsoft.com/office/word/2006/wordml" xmlns:wps="http://schemas.microsoft.com/office/word/2010/wordprocessingShape" mc:Ignorable="w14 w15 w16se w16cid w16 w16cex w16sdtdh w16sdtfl w16du wp14">
   <w:abstractNum w:abstractNumId="0" w15:restartNumberingAfterBreak="0">
     <w:nsid w:val="FFFFFF1D"/>
     <w:multiLevelType w:val="multilevel"/>
@@ -592,7 +592,7 @@
       <w:lvlText w:val="%1.  "/>
       <w:lvlJc w:val="left"/>
       <w:pPr>
-        <w:ind w:left="0" w:firstLine="0"/>
+        <w:ind w:left="540" w:hanging="360"/>
       </w:pPr>
       <w:rPr>
         <w:rFonts w:hint="default"/>
@@ -606,7 +606,7 @@
       <w:lvlText w:val="%2.  "/>
       <w:lvlJc w:val="left"/>
       <w:pPr>
-        <w:ind w:left="0" w:firstLine="0"/>
+        <w:ind w:left="720" w:hanging="360"/>
       </w:pPr>
       <w:rPr>
         <w:rFonts w:hint="default"/>
@@ -619,7 +619,7 @@
       <w:lvlText w:val="%3.  "/>
       <w:lvlJc w:val="left"/>
       <w:pPr>
-        <w:ind w:left="0" w:firstLine="720"/>
+        <w:ind w:left="720" w:hanging="360"/>
       </w:pPr>
       <w:rPr>
         <w:rFonts w:hint="default"/>
@@ -633,7 +633,7 @@
       <w:lvlText w:val="%4.  "/>
       <w:lvlJc w:val="left"/>
       <w:pPr>
-        <w:ind w:left="0" w:firstLine="1440"/>
+        <w:ind w:left="720" w:firstLine="360"/>
       </w:pPr>
       <w:rPr>
         <w:rFonts w:hint="default"/>
@@ -646,7 +646,7 @@
       <w:lvlText w:val="%5.  "/>
       <w:lvlJc w:val="left"/>
       <w:pPr>
-        <w:ind w:left="0" w:firstLine="2160"/>
+        <w:ind w:left="1080" w:hanging="360"/>
       </w:pPr>
       <w:rPr>
         <w:rFonts w:hint="default"/>
@@ -826,7 +826,7 @@
       <w:lvlText w:val="%1.  "/>
       <w:lvlJc w:val="left"/>
       <w:pPr>
-        <w:ind w:left="0" w:firstLine="0"/>
+        <w:ind w:left="540" w:hanging="360"/>
       </w:pPr>
       <w:rPr>
         <w:rFonts w:hint="default"/>
@@ -840,7 +840,7 @@
       <w:lvlText w:val="%2.  "/>
       <w:lvlJc w:val="left"/>
       <w:pPr>
-        <w:ind w:left="0" w:firstLine="0"/>
+        <w:ind w:left="720" w:hanging="360"/>
       </w:pPr>
       <w:rPr>
         <w:rFonts w:hint="default"/>
@@ -853,7 +853,7 @@
       <w:lvlText w:val="%3.  "/>
       <w:lvlJc w:val="left"/>
       <w:pPr>
-        <w:ind w:left="0" w:firstLine="720"/>
+        <w:ind w:left="720" w:hanging="360"/>
       </w:pPr>
       <w:rPr>
         <w:rFonts w:hint="default"/>
@@ -867,7 +867,7 @@
       <w:lvlText w:val="%4.  "/>
       <w:lvlJc w:val="left"/>
       <w:pPr>
-        <w:ind w:left="0" w:firstLine="1440"/>
+        <w:ind w:left="720" w:firstLine="360"/>
       </w:pPr>
       <w:rPr>
         <w:rFonts w:hint="default"/>
@@ -881,7 +881,7 @@
       <w:lvlText w:val="%5.  "/>
       <w:lvlJc w:val="left"/>
       <w:pPr>
-        <w:ind w:left="0" w:firstLine="2160"/>
+        <w:ind w:left="1080" w:hanging="360"/>
       </w:pPr>
       <w:rPr>
         <w:rFonts w:hint="default"/>
@@ -3155,90 +3155,90 @@
       </w:pPr>
     </w:lvl>
   </w:abstractNum>
-  <w:num w:numId="1">
+  <w:num w:numId="1" w16cid:durableId="159583337">
     <w:abstractNumId w:val="13"/>
   </w:num>
-  <w:num w:numId="2">
+  <w:num w:numId="2" w16cid:durableId="402220737">
     <w:abstractNumId w:val="4"/>
   </w:num>
-  <w:num w:numId="3">
+  <w:num w:numId="3" w16cid:durableId="108744288">
     <w:abstractNumId w:val="8"/>
   </w:num>
-  <w:num w:numId="4">
+  <w:num w:numId="4" w16cid:durableId="1186596004">
     <w:abstractNumId w:val="10"/>
   </w:num>
-  <w:num w:numId="5">
+  <w:num w:numId="5" w16cid:durableId="2049450048">
     <w:abstractNumId w:val="7"/>
   </w:num>
-  <w:num w:numId="6">
+  <w:num w:numId="6" w16cid:durableId="682782599">
     <w:abstractNumId w:val="1"/>
   </w:num>
-  <w:num w:numId="7">
+  <w:num w:numId="7" w16cid:durableId="1041368811">
     <w:abstractNumId w:val="2"/>
   </w:num>
-  <w:num w:numId="8">
+  <w:num w:numId="8" w16cid:durableId="1063330464">
     <w:abstractNumId w:val="19"/>
   </w:num>
-  <w:num w:numId="9">
+  <w:num w:numId="9" w16cid:durableId="238517160">
     <w:abstractNumId w:val="17"/>
   </w:num>
-  <w:num w:numId="10">
+  <w:num w:numId="10" w16cid:durableId="1740979854">
     <w:abstractNumId w:val="20"/>
   </w:num>
-  <w:num w:numId="11">
+  <w:num w:numId="11" w16cid:durableId="195898036">
     <w:abstractNumId w:val="5"/>
   </w:num>
-  <w:num w:numId="12">
+  <w:num w:numId="12" w16cid:durableId="474950939">
     <w:abstractNumId w:val="14"/>
   </w:num>
-  <w:num w:numId="13">
+  <w:num w:numId="13" w16cid:durableId="941962523">
     <w:abstractNumId w:val="22"/>
   </w:num>
-  <w:num w:numId="14">
+  <w:num w:numId="14" w16cid:durableId="1419595141">
     <w:abstractNumId w:val="9"/>
   </w:num>
-  <w:num w:numId="15">
+  <w:num w:numId="15" w16cid:durableId="344402977">
     <w:abstractNumId w:val="24"/>
   </w:num>
-  <w:num w:numId="16">
+  <w:num w:numId="16" w16cid:durableId="1476680360">
     <w:abstractNumId w:val="15"/>
   </w:num>
-  <w:num w:numId="17">
+  <w:num w:numId="17" w16cid:durableId="1376541114">
     <w:abstractNumId w:val="0"/>
   </w:num>
-  <w:num w:numId="18">
+  <w:num w:numId="18" w16cid:durableId="208613457">
     <w:abstractNumId w:val="3"/>
   </w:num>
-  <w:num w:numId="19">
+  <w:num w:numId="19" w16cid:durableId="568614297">
     <w:abstractNumId w:val="18"/>
   </w:num>
-  <w:num w:numId="20">
+  <w:num w:numId="20" w16cid:durableId="1787699715">
     <w:abstractNumId w:val="11"/>
   </w:num>
-  <w:num w:numId="21">
+  <w:num w:numId="21" w16cid:durableId="1143808743">
     <w:abstractNumId w:val="6"/>
   </w:num>
-  <w:num w:numId="22">
+  <w:num w:numId="22" w16cid:durableId="1461144366">
     <w:abstractNumId w:val="16"/>
   </w:num>
-  <w:num w:numId="23">
+  <w:num w:numId="23" w16cid:durableId="1185050443">
     <w:abstractNumId w:val="21"/>
   </w:num>
-  <w:num w:numId="24">
+  <w:num w:numId="24" w16cid:durableId="493103570">
     <w:abstractNumId w:val="12"/>
   </w:num>
-  <w:num w:numId="25">
+  <w:num w:numId="25" w16cid:durableId="2060744846">
     <w:abstractNumId w:val="23"/>
   </w:num>
 </w:numbering>
 </file>
 
 <file path=word/styles.xml><?xml version="1.0" encoding="utf-8"?>
-<w:styles xmlns:mc="http://schemas.openxmlformats.org/markup-compatibility/2006" xmlns:r="http://schemas.openxmlformats.org/officeDocument/2006/relationships" xmlns:w="http://schemas.openxmlformats.org/wordprocessingml/2006/main" xmlns:w14="http://schemas.microsoft.com/office/word/2010/wordml" xmlns:w15="http://schemas.microsoft.com/office/word/2012/wordml" xmlns:w16cex="http://schemas.microsoft.com/office/word/2018/wordml/cex" xmlns:w16cid="http://schemas.microsoft.com/office/word/2016/wordml/cid" xmlns:w16="http://schemas.microsoft.com/office/word/2018/wordml" xmlns:w16se="http://schemas.microsoft.com/office/word/2015/wordml/symex" mc:Ignorable="w14 w15 w16se w16cid w16 w16cex">
+<w:styles xmlns:mc="http://schemas.openxmlformats.org/markup-compatibility/2006" xmlns:r="http://schemas.openxmlformats.org/officeDocument/2006/relationships" xmlns:w="http://schemas.openxmlformats.org/wordprocessingml/2006/main" xmlns:w14="http://schemas.microsoft.com/office/word/2010/wordml" xmlns:w15="http://schemas.microsoft.com/office/word/2012/wordml" xmlns:w16cex="http://schemas.microsoft.com/office/word/2018/wordml/cex" xmlns:w16cid="http://schemas.microsoft.com/office/word/2016/wordml/cid" xmlns:w16="http://schemas.microsoft.com/office/word/2018/wordml" xmlns:w16du="http://schemas.microsoft.com/office/word/2023/wordml/word16du" xmlns:w16sdtdh="http://schemas.microsoft.com/office/word/2020/wordml/sdtdatahash" xmlns:w16sdtfl="http://schemas.microsoft.com/office/word/2024/wordml/sdtformatlock" xmlns:w16se="http://schemas.microsoft.com/office/word/2015/wordml/symex" mc:Ignorable="w14 w15 w16se w16cid w16 w16cex w16sdtdh w16sdtfl w16du">
   <w:docDefaults>
     <w:rPrDefault>
       <w:rPr>
-        <w:rFonts w:ascii="Century Schoolbook" w:eastAsiaTheme="minorEastAsia" w:hAnsi="Century Schoolbook" w:cs="Times New Roman"/>
+        <w:rFonts w:ascii="Garamond" w:eastAsiaTheme="minorEastAsia" w:hAnsi="Garamond" w:cs="Times New Roman"/>
         <w:sz w:val="24"/>
         <w:lang w:val="en-US" w:eastAsia="en-US" w:bidi="ar-SA"/>
       </w:rPr>
@@ -3634,16 +3634,13 @@
     <w:rsid w:val="00011ADF"/>
     <w:pPr>
       <w:keepNext/>
-      <w:tabs>
-        <w:tab w:val="left" w:leader="dot" w:pos="677"/>
-      </w:tabs>
       <w:suppressAutoHyphens/>
-      <w:spacing w:after="240"/>
-      <w:jc w:val="center"/>
+      <w:spacing w:before="360" w:after="80"/>
+      <w:ind w:left="540" w:hanging="360"/>
       <w:outlineLvl w:val="0"/>
     </w:pPr>
     <w:rPr>
-      <w:smallCaps/>
+      <w:b/>
     </w:rPr>
   </w:style>
   <w:style w:type="paragraph" w:styleId="Heading2">
@@ -3651,7 +3648,6 @@
     <w:basedOn w:val="BodyText"/>
     <w:next w:val="BodyText"/>
     <w:link w:val="Heading2Char"/>
-    <w:autoRedefine/>
     <w:uiPriority w:val="9"/>
     <w:unhideWhenUsed/>
     <w:qFormat/>
@@ -3659,12 +3655,12 @@
     <w:pPr>
       <w:keepNext/>
       <w:suppressAutoHyphens/>
-      <w:spacing w:after="0" w:line="480" w:lineRule="auto"/>
+      <w:spacing w:before="160" w:after="80"/>
+      <w:ind w:left="720" w:hanging="360"/>
       <w:outlineLvl w:val="1"/>
     </w:pPr>
     <w:rPr>
-      <w:rFonts w:ascii="Times New Roman" w:hAnsi="Times New Roman"/>
-      <w:szCs w:val="24"/>
+      <w:b/>
     </w:rPr>
   </w:style>
   <w:style w:type="paragraph" w:styleId="Heading3">
@@ -3672,7 +3668,6 @@
     <w:basedOn w:val="BodyText"/>
     <w:next w:val="BodyText"/>
     <w:link w:val="Heading3Char"/>
-    <w:autoRedefine/>
     <w:uiPriority w:val="9"/>
     <w:unhideWhenUsed/>
     <w:qFormat/>
@@ -3680,12 +3675,12 @@
     <w:pPr>
       <w:keepNext/>
       <w:suppressAutoHyphens/>
-      <w:spacing w:after="240"/>
+      <w:spacing w:before="160" w:after="80"/>
+      <w:ind w:left="720" w:hanging="360"/>
       <w:outlineLvl w:val="2"/>
     </w:pPr>
     <w:rPr>
-      <w:rFonts w:ascii="Times New Roman" w:hAnsi="Times New Roman"/>
-      <w:szCs w:val="24"/>
+      <w:i/>
     </w:rPr>
   </w:style>
   <w:style w:type="paragraph" w:styleId="Heading4">
@@ -3700,12 +3695,11 @@
     <w:pPr>
       <w:keepNext/>
       <w:suppressAutoHyphens/>
-      <w:spacing w:after="240"/>
-      <w:ind w:left="720" w:firstLine="720"/>
+      <w:spacing w:before="80" w:after="40"/>
+      <w:ind w:left="720"/>
       <w:outlineLvl w:val="3"/>
     </w:pPr>
     <w:rPr>
-      <w:rFonts w:ascii="Times New Roman" w:hAnsi="Times New Roman"/>
       <w:i/>
     </w:rPr>
   </w:style>
@@ -3725,7 +3719,7 @@
         <w:numId w:val="2"/>
       </w:numPr>
       <w:suppressAutoHyphens/>
-      <w:spacing w:after="240"/>
+      <w:spacing w:before="80" w:after="40"/>
       <w:outlineLvl w:val="4"/>
     </w:pPr>
     <w:rPr>
@@ -3789,10 +3783,7 @@
     <w:uiPriority w:val="9"/>
     <w:rsid w:val="00011ADF"/>
     <w:rPr>
-      <w:smallCaps/>
-      <w:sz w:val="20"/>
-      <w:szCs w:val="20"/>
-      <w:lang w:eastAsia="ko-KR" w:bidi="en-US"/>
+      <w:b/>
     </w:rPr>
   </w:style>
   <w:style w:type="character" w:customStyle="1" w:styleId="Heading2Char">
@@ -3802,8 +3793,7 @@
     <w:uiPriority w:val="9"/>
     <w:rsid w:val="00C40709"/>
     <w:rPr>
-      <w:rFonts w:ascii="Times New Roman" w:hAnsi="Times New Roman"/>
-      <w:szCs w:val="24"/>
+      <w:b/>
     </w:rPr>
   </w:style>
   <w:style w:type="character" w:customStyle="1" w:styleId="Heading3Char">
@@ -3813,8 +3803,7 @@
     <w:uiPriority w:val="9"/>
     <w:rsid w:val="00DE00BD"/>
     <w:rPr>
-      <w:rFonts w:ascii="Times New Roman" w:hAnsi="Times New Roman"/>
-      <w:szCs w:val="24"/>
+      <w:i/>
     </w:rPr>
   </w:style>
   <w:style w:type="character" w:customStyle="1" w:styleId="Heading4Char">
@@ -3824,7 +3813,6 @@
     <w:uiPriority w:val="9"/>
     <w:rsid w:val="009F0DDB"/>
     <w:rPr>
-      <w:rFonts w:ascii="Times New Roman" w:hAnsi="Times New Roman"/>
       <w:i/>
     </w:rPr>
   </w:style>
@@ -3841,15 +3829,12 @@
   </w:style>
   <w:style w:type="paragraph" w:styleId="TOCHeading">
     <w:name w:val="TOC Heading"/>
-    <w:basedOn w:val="Heading1"/>
+    <w:basedOn w:val="Title"/>
     <w:next w:val="Normal"/>
     <w:uiPriority w:val="39"/>
     <w:unhideWhenUsed/>
     <w:qFormat/>
     <w:rsid w:val="00CB3812"/>
-    <w:pPr>
-      <w:outlineLvl w:val="9"/>
-    </w:pPr>
   </w:style>
   <w:style w:type="paragraph" w:styleId="TOC1">
     <w:name w:val="toc 1"/>
@@ -3866,7 +3851,6 @@
       <w:jc w:val="left"/>
     </w:pPr>
     <w:rPr>
-      <w:rFonts w:ascii="Times New Roman" w:hAnsi="Times New Roman"/>
       <w:sz w:val="20"/>
       <w:szCs w:val="24"/>
     </w:rPr>
@@ -3899,7 +3883,8 @@
     <w:unhideWhenUsed/>
     <w:rsid w:val="00CB3812"/>
     <w:pPr>
-      <w:spacing w:after="120"/>
+      <w:spacing w:after="160" w:line="278" w:lineRule="auto"/>
+      <w:ind w:firstLine="360"/>
       <w:contextualSpacing w:val="0"/>
     </w:pPr>
   </w:style>
@@ -3909,8 +3894,6 @@
     <w:uiPriority w:val="99"/>
     <w:pPr>
       <w:spacing w:after="120"/>
-      <w:ind w:firstLine="0"/>
-      <w:contextualSpacing w:val="0"/>
     </w:pPr>
   </w:style>
   <w:style w:type="character" w:customStyle="1" w:styleId="BodyTextChar">
@@ -4038,9 +4021,6 @@
     <w:pPr>
       <w:spacing w:before="100" w:beforeAutospacing="1" w:after="100" w:afterAutospacing="1"/>
     </w:pPr>
-    <w:rPr>
-      <w:rFonts w:ascii="Times" w:hAnsi="Times"/>
-    </w:rPr>
   </w:style>
   <w:style w:type="paragraph" w:customStyle="1" w:styleId="Heading">
     <w:name w:val="Heading"/>
@@ -4085,7 +4065,6 @@
       <w:jc w:val="left"/>
     </w:pPr>
     <w:rPr>
-      <w:rFonts w:ascii="Times New Roman" w:hAnsi="Times New Roman"/>
       <w:sz w:val="20"/>
       <w:szCs w:val="22"/>
     </w:rPr>
@@ -4107,7 +4086,6 @@
       <w:jc w:val="left"/>
     </w:pPr>
     <w:rPr>
-      <w:rFonts w:ascii="Times New Roman" w:hAnsi="Times New Roman"/>
       <w:sz w:val="20"/>
       <w:szCs w:val="22"/>
     </w:rPr>
@@ -4149,7 +4127,6 @@
       <w:jc w:val="left"/>
     </w:pPr>
     <w:rPr>
-      <w:rFonts w:ascii="Times New Roman" w:hAnsi="Times New Roman"/>
       <w:sz w:val="20"/>
     </w:rPr>
   </w:style>
@@ -4169,7 +4146,6 @@
       <w:jc w:val="left"/>
     </w:pPr>
     <w:rPr>
-      <w:rFonts w:ascii="Times New Roman" w:hAnsi="Times New Roman"/>
       <w:sz w:val="20"/>
     </w:rPr>
   </w:style>
@@ -4377,7 +4353,6 @@
     <w:name w:val="FN Style *Best"/>
     <w:basedOn w:val="FootnoteText"/>
     <w:link w:val="FNStyleBestChar"/>
-    <w:autoRedefine/>
     <w:qFormat/>
     <w:rsid w:val="001732E1"/>
     <w:pPr>
@@ -4388,9 +4363,7 @@
       <w:ind w:firstLine="677"/>
     </w:pPr>
     <w:rPr>
-      <w:rFonts w:ascii="Times New Roman" w:hAnsi="Times New Roman"/>
       <w:sz w:val="20"/>
-      <w:szCs w:val="24"/>
       <w:u w:color="0077CC"/>
       <w:shd w:val="clear" w:color="auto" w:fill="FFFFFF"/>
     </w:rPr>
@@ -4401,9 +4374,7 @@
     <w:link w:val="FNStyleBest"/>
     <w:rsid w:val="001732E1"/>
     <w:rPr>
-      <w:rFonts w:ascii="Times New Roman" w:hAnsi="Times New Roman"/>
       <w:sz w:val="20"/>
-      <w:szCs w:val="24"/>
       <w:u w:color="0077CC"/>
       <w:lang w:eastAsia="ko-KR" w:bidi="en-US"/>
     </w:rPr>
@@ -4417,7 +4388,6 @@
     <w:rsid w:val="00EB0932"/>
     <w:pPr>
       <w:spacing w:after="0"/>
-      <w:ind w:firstLine="360"/>
     </w:pPr>
   </w:style>
   <w:style w:type="character" w:customStyle="1" w:styleId="BodyTextFirstIndentChar">
@@ -4512,9 +4482,6 @@
     <w:pPr>
       <w:ind w:firstLine="677"/>
     </w:pPr>
-    <w:rPr>
-      <w:rFonts w:ascii="Times New Roman" w:hAnsi="Times New Roman"/>
-    </w:rPr>
   </w:style>
   <w:style w:type="character" w:styleId="PlaceholderText">
     <w:name w:val="Placeholder Text"/>
@@ -4606,6 +4573,22 @@
     <w:rPr>
       <w:color w:val="605E5C"/>
       <w:shd w:val="clear" w:color="auto" w:fill="E1DFDD"/>
+    </w:rPr>
+  </w:style>
+  <w:style w:type="paragraph" w:styleId="Title">
+    <w:name w:val="Title"/>
+    <w:basedOn w:val="Normal"/>
+    <w:next w:val="BodyText"/>
+    <w:uiPriority w:val="10"/>
+    <w:qFormat/>
+    <w:pPr>
+      <w:keepNext/>
+      <w:spacing w:before="240" w:after="240"/>
+      <w:jc w:val="center"/>
+    </w:pPr>
+    <w:rPr>
+      <w:b/>
+      <w:smallCaps/>
     </w:rPr>
   </w:style>
 </w:styles>
@@ -4932,6 +4915,21 @@
 </file>
 
 <file path=customXml/item1.xml><?xml version="1.0" encoding="utf-8"?>
+<p:properties xmlns:p="http://schemas.microsoft.com/office/2006/metadata/properties" xmlns:xsi="http://www.w3.org/2001/XMLSchema-instance" xmlns:pc="http://schemas.microsoft.com/office/infopath/2007/PartnerControls">
+  <documentManagement>
+    <CS_x0020_Editor xmlns="1a65b713-3aab-417a-9758-4b8674c27c0b">
+      <Value>Scholl</Value>
+      <Value>Ramos</Value>
+    </CS_x0020_Editor>
+    <Edition xmlns="1a65b713-3aab-417a-9758-4b8674c27c0b">51-1</Edition>
+    <Author0 xmlns="1a65b713-3aab-417a-9758-4b8674c27c0b" xsi:nil="true"/>
+    <Ready_x0020_For_x0020_Back_x0020_Office_x0020_Review_x003f_ xmlns="1a65b713-3aab-417a-9758-4b8674c27c0b">Yes</Ready_x0020_For_x0020_Back_x0020_Office_x0020_Review_x003f_>
+    <Team_x0020_Leader_x0020_Sendbacks xmlns="1a65b713-3aab-417a-9758-4b8674c27c0b" xsi:nil="true"/>
+  </documentManagement>
+</p:properties>
+</file>
+
+<file path=customXml/item2.xml><?xml version="1.0" encoding="utf-8"?>
 <ct:contentTypeSchema xmlns:ct="http://schemas.microsoft.com/office/2006/metadata/contentType" xmlns:ma="http://schemas.microsoft.com/office/2006/metadata/properties/metaAttributes" ct:_="" ma:_="" ma:contentTypeName="Document" ma:contentTypeID="0x010100F66B5D9084A1F94587680ADB4821D600" ma:contentTypeVersion="8" ma:contentTypeDescription="Create a new document." ma:contentTypeScope="" ma:versionID="bb2c97112c22ebb8b1b00dc20af68bbf">
   <xsd:schema xmlns:xsd="http://www.w3.org/2001/XMLSchema" xmlns:xs="http://www.w3.org/2001/XMLSchema" xmlns:p="http://schemas.microsoft.com/office/2006/metadata/properties" xmlns:ns2="1a65b713-3aab-417a-9758-4b8674c27c0b" xmlns:ns3="a92d31f1-4500-49a7-81d4-7c1506e43968" targetNamespace="http://schemas.microsoft.com/office/2006/metadata/properties" ma:root="true" ma:fieldsID="e2b02854f879fa6debb3d824434531d4" ns2:_="" ns3:_="">
     <xsd:import namespace="1a65b713-3aab-417a-9758-4b8674c27c0b"/>
@@ -5159,26 +5157,7 @@
 </ct:contentTypeSchema>
 </file>
 
-<file path=customXml/item2.xml><?xml version="1.0" encoding="utf-8"?>
-<p:properties xmlns:p="http://schemas.microsoft.com/office/2006/metadata/properties" xmlns:xsi="http://www.w3.org/2001/XMLSchema-instance" xmlns:pc="http://schemas.microsoft.com/office/infopath/2007/PartnerControls">
-  <documentManagement>
-    <CS_x0020_Editor xmlns="1a65b713-3aab-417a-9758-4b8674c27c0b">
-      <Value>Scholl</Value>
-      <Value>Ramos</Value>
-    </CS_x0020_Editor>
-    <Edition xmlns="1a65b713-3aab-417a-9758-4b8674c27c0b">51-1</Edition>
-    <Author0 xmlns="1a65b713-3aab-417a-9758-4b8674c27c0b" xsi:nil="true"/>
-    <Ready_x0020_For_x0020_Back_x0020_Office_x0020_Review_x003f_ xmlns="1a65b713-3aab-417a-9758-4b8674c27c0b">Yes</Ready_x0020_For_x0020_Back_x0020_Office_x0020_Review_x003f_>
-    <Team_x0020_Leader_x0020_Sendbacks xmlns="1a65b713-3aab-417a-9758-4b8674c27c0b" xsi:nil="true"/>
-  </documentManagement>
-</p:properties>
-</file>
-
 <file path=customXml/item3.xml><?xml version="1.0" encoding="utf-8"?>
-<b:Sources xmlns:b="http://schemas.openxmlformats.org/officeDocument/2006/bibliography" xmlns="http://schemas.openxmlformats.org/officeDocument/2006/bibliography" SelectedStyle="/APA.XSL" StyleName="APA"/>
-</file>
-
-<file path=customXml/item4.xml><?xml version="1.0" encoding="utf-8"?>
 <?mso-contentType ?>
 <FormTemplates xmlns="http://schemas.microsoft.com/sharepoint/v3/contenttype/forms">
   <Display>DocumentLibraryForm</Display>
@@ -5187,7 +5166,21 @@
 </FormTemplates>
 </file>
 
+<file path=customXml/item4.xml><?xml version="1.0" encoding="utf-8"?>
+<b:Sources xmlns:b="http://schemas.openxmlformats.org/officeDocument/2006/bibliography" xmlns="http://schemas.openxmlformats.org/officeDocument/2006/bibliography" SelectedStyle="/APA.XSL" StyleName="APA"/>
+</file>
+
 <file path=customXml/itemProps1.xml><?xml version="1.0" encoding="utf-8"?>
+<ds:datastoreItem xmlns:ds="http://schemas.openxmlformats.org/officeDocument/2006/customXml" ds:itemID="{341DF0A7-B8FD-4F9A-96F1-7DDD03699639}">
+  <ds:schemaRefs>
+    <ds:schemaRef ds:uri="http://schemas.microsoft.com/office/2006/metadata/properties"/>
+    <ds:schemaRef ds:uri="http://schemas.microsoft.com/office/infopath/2007/PartnerControls"/>
+    <ds:schemaRef ds:uri="1a65b713-3aab-417a-9758-4b8674c27c0b"/>
+  </ds:schemaRefs>
+</ds:datastoreItem>
+</file>
+
+<file path=customXml/itemProps2.xml><?xml version="1.0" encoding="utf-8"?>
 <ds:datastoreItem xmlns:ds="http://schemas.openxmlformats.org/officeDocument/2006/customXml" ds:itemID="{18012A18-49A0-46BB-A4F6-6D0621BAD9D5}">
   <ds:schemaRefs>
     <ds:schemaRef ds:uri="http://schemas.microsoft.com/office/2006/metadata/contentType"/>
@@ -5206,28 +5199,18 @@
 </ds:datastoreItem>
 </file>
 
-<file path=customXml/itemProps2.xml><?xml version="1.0" encoding="utf-8"?>
-<ds:datastoreItem xmlns:ds="http://schemas.openxmlformats.org/officeDocument/2006/customXml" ds:itemID="{341DF0A7-B8FD-4F9A-96F1-7DDD03699639}">
+<file path=customXml/itemProps3.xml><?xml version="1.0" encoding="utf-8"?>
+<ds:datastoreItem xmlns:ds="http://schemas.openxmlformats.org/officeDocument/2006/customXml" ds:itemID="{1C575FDC-16C5-4315-8993-E92323D3F4C7}">
   <ds:schemaRefs>
-    <ds:schemaRef ds:uri="http://schemas.microsoft.com/office/2006/metadata/properties"/>
-    <ds:schemaRef ds:uri="http://schemas.microsoft.com/office/infopath/2007/PartnerControls"/>
-    <ds:schemaRef ds:uri="1a65b713-3aab-417a-9758-4b8674c27c0b"/>
+    <ds:schemaRef ds:uri="http://schemas.microsoft.com/sharepoint/v3/contenttype/forms"/>
   </ds:schemaRefs>
 </ds:datastoreItem>
 </file>
 
-<file path=customXml/itemProps3.xml><?xml version="1.0" encoding="utf-8"?>
+<file path=customXml/itemProps4.xml><?xml version="1.0" encoding="utf-8"?>
 <ds:datastoreItem xmlns:ds="http://schemas.openxmlformats.org/officeDocument/2006/customXml" ds:itemID="{F0FF3622-080C-7A47-A0AD-12C9B6CA94DD}">
   <ds:schemaRefs>
     <ds:schemaRef ds:uri="http://schemas.openxmlformats.org/officeDocument/2006/bibliography"/>
   </ds:schemaRefs>
 </ds:datastoreItem>
-</file>
-
-<file path=customXml/itemProps4.xml><?xml version="1.0" encoding="utf-8"?>
-<ds:datastoreItem xmlns:ds="http://schemas.openxmlformats.org/officeDocument/2006/customXml" ds:itemID="{1C575FDC-16C5-4315-8993-E92323D3F4C7}">
-  <ds:schemaRefs>
-    <ds:schemaRef ds:uri="http://schemas.microsoft.com/sharepoint/v3/contenttype/forms"/>
-  </ds:schemaRefs>
-</ds:datastoreItem>
 </file>
</xml_diff>